<commit_message>
actualización del taller T02 y matriz
</commit_message>
<xml_diff>
--- a/TALLER QA-T02 EVALUACIÓN DEL PROYECTO MEDIANTE ISO_IEC 25010.docx
+++ b/TALLER QA-T02 EVALUACIÓN DEL PROYECTO MEDIANTE ISO_IEC 25010.docx
@@ -301,38 +301,7 @@
         <w:rPr>
           <w:rtl w:val="0"/>
         </w:rPr>
-        <w:t xml:space="preserve">R. Esta norma tiene como proposito definir, evaluar y medir la calidad de un sistema software</w:t>
-      </w:r>
-    </w:p>
-    <w:p>
-      <w:pPr>
-        <w:numPr>
-          <w:ilvl w:val="0"/>
-          <w:numId w:val="8"/>
-        </w:numPr>
-        <w:spacing w:after="0" w:before="240" w:line="240" w:lineRule="auto"/>
-        <w:ind w:left="720" w:hanging="360"/>
-        <w:rPr>
-          <w:u w:val="none"/>
-        </w:rPr>
-      </w:pPr>
-      <w:r>
-        <w:rPr>
-          <w:rtl w:val="0"/>
-        </w:rPr>
-      </w:r>
-    </w:p>
-    <w:p>
-      <w:pPr>
-        <w:spacing w:after="0" w:before="240" w:line="240" w:lineRule="auto"/>
-        <w:ind w:left="720" w:firstLine="0"/>
-        <w:rPr/>
-      </w:pPr>
-      <w:r>
-        <w:rPr>
-          <w:rtl w:val="0"/>
-        </w:rPr>
-        <w:t xml:space="preserve">R. </w:t>
+        <w:t xml:space="preserve">R. Esta norma tiene como propósito definir, evaluar y medir la calidad de un sistema software</w:t>
       </w:r>
     </w:p>
     <w:p>
@@ -374,7 +343,7 @@
         <w:rPr>
           <w:rtl w:val="0"/>
         </w:rPr>
-        <w:t xml:space="preserve">R. Esta norma evalua la calidad de productos y sistemas de software estableciendo requisiros claros antes, durante y despues del desarrollo.</w:t>
+        <w:t xml:space="preserve">R. Esta norma evalúa la calidad de productos y sistemas de software estableciendo requisitos claros antes, durante y después del desarrollo.</w:t>
       </w:r>
     </w:p>
     <w:p>
@@ -408,25 +377,6 @@
     </w:p>
     <w:p>
       <w:pPr>
-        <w:numPr>
-          <w:ilvl w:val="0"/>
-          <w:numId w:val="8"/>
-        </w:numPr>
-        <w:spacing w:after="240" w:before="0" w:line="240" w:lineRule="auto"/>
-        <w:ind w:left="720" w:hanging="360"/>
-        <w:rPr>
-          <w:u w:val="none"/>
-        </w:rPr>
-      </w:pPr>
-      <w:r>
-        <w:rPr>
-          <w:rtl w:val="0"/>
-        </w:rPr>
-        <w:t xml:space="preserve">R. Estas pruebas son importantes para garantizar la calidad del software y que cumpla con los requisitos establecidos por la ISO. </w:t>
-      </w:r>
-    </w:p>
-    <w:p>
-      <w:pPr>
         <w:spacing w:after="240" w:before="0" w:line="240" w:lineRule="auto"/>
         <w:ind w:left="720" w:firstLine="0"/>
         <w:rPr/>
@@ -435,7 +385,7 @@
         <w:rPr>
           <w:rtl w:val="0"/>
         </w:rPr>
-        <w:t xml:space="preserve">R: Es importante porque nos ayuda evaluar nuestro software y su calidad, asegurado que el software cumpla con los requisitos de calidad necesarios para satisfacer las necesidades del cliente.</w:t>
+        <w:t xml:space="preserve">R: Es importante porque nos ayuda a evaluar nuestro software y su calidad, asegurando que el software cumpla con los requisitos de calidad necesarios para satisfacer las necesidades del cliente.</w:t>
       </w:r>
     </w:p>
     <w:p>
@@ -725,7 +675,7 @@
               <w:rPr>
                 <w:rtl w:val="0"/>
               </w:rPr>
-              <w:t xml:space="preserve">Nustro sistema esta diseñado solucionar una problematica, en la que le brindamos al usuario multiples funciones para su navegación.</w:t>
+              <w:t xml:space="preserve">Nuestro sistema está diseñado para solucionar una problemática, en la que le brindamos al usuario múltiples funciones para su navegación.</w:t>
             </w:r>
           </w:p>
         </w:tc>
@@ -913,7 +863,7 @@
               <w:rPr>
                 <w:rtl w:val="0"/>
               </w:rPr>
-              <w:t xml:space="preserve">El sistema es compatible con dispositivos PC y movil</w:t>
+              <w:t xml:space="preserve">El sistema es compatible con dispositivos PC y móvil</w:t>
             </w:r>
           </w:p>
         </w:tc>
@@ -1007,7 +957,7 @@
               <w:rPr>
                 <w:rtl w:val="0"/>
               </w:rPr>
-              <w:t xml:space="preserve">El sistema es facil de usar y tiene funciones claras para el disfrute de todos los usuarios.</w:t>
+              <w:t xml:space="preserve">El sistema es fácil de usar y tiene funciones claras para el disfrute de todos los usuarios.</w:t>
             </w:r>
           </w:p>
         </w:tc>
@@ -1101,7 +1051,7 @@
               <w:rPr>
                 <w:rtl w:val="0"/>
               </w:rPr>
-              <w:t xml:space="preserve">El sistema es totalmete fiable, seguro y facil de usar.</w:t>
+              <w:t xml:space="preserve">El sistema es totalmente fiable, seguro y fácil de usar.</w:t>
             </w:r>
           </w:p>
         </w:tc>
@@ -1195,7 +1145,7 @@
               <w:rPr>
                 <w:rtl w:val="0"/>
               </w:rPr>
-              <w:t xml:space="preserve">Nustro sistema cuenta con tiken de verificación para la protección de los datos.</w:t>
+              <w:t xml:space="preserve">Nuestro sistema cuenta con token de verificación para la protección de los datos.</w:t>
             </w:r>
           </w:p>
         </w:tc>
@@ -1383,6 +1333,7 @@
               <w:rPr>
                 <w:rtl w:val="0"/>
               </w:rPr>
+              <w:t xml:space="preserve">Nustro sistema se adapta satisfactoriamente a todos los sistemas operativos.</w:t>
             </w:r>
           </w:p>
         </w:tc>
@@ -1407,6 +1358,78 @@
           <w:rtl w:val="0"/>
         </w:rPr>
         <w:t xml:space="preserve"> Toda calificación debe justificarse con evidencias del proyecto.</w:t>
+      </w:r>
+    </w:p>
+    <w:p>
+      <w:pPr>
+        <w:keepNext w:val="0"/>
+        <w:keepLines w:val="0"/>
+        <w:spacing w:before="480" w:line="240" w:lineRule="auto"/>
+        <w:rPr>
+          <w:b w:val="1"/>
+          <w:bCs w:val="1"/>
+          <w:sz w:val="24"/>
+          <w:szCs w:val="24"/>
+        </w:rPr>
+      </w:pPr>
+      <w:r>
+        <w:rPr>
+          <w:rtl w:val="0"/>
+        </w:rPr>
+      </w:r>
+    </w:p>
+    <w:p>
+      <w:pPr>
+        <w:keepNext w:val="0"/>
+        <w:keepLines w:val="0"/>
+        <w:spacing w:before="480" w:line="240" w:lineRule="auto"/>
+        <w:rPr>
+          <w:b w:val="1"/>
+          <w:bCs w:val="1"/>
+          <w:sz w:val="24"/>
+          <w:szCs w:val="24"/>
+        </w:rPr>
+      </w:pPr>
+      <w:r>
+        <w:rPr>
+          <w:rtl w:val="0"/>
+        </w:rPr>
+      </w:r>
+    </w:p>
+    <w:p>
+      <w:pPr>
+        <w:keepNext w:val="0"/>
+        <w:keepLines w:val="0"/>
+        <w:spacing w:before="480" w:line="240" w:lineRule="auto"/>
+        <w:rPr>
+          <w:b w:val="1"/>
+          <w:bCs w:val="1"/>
+          <w:sz w:val="24"/>
+          <w:szCs w:val="24"/>
+        </w:rPr>
+      </w:pPr>
+      <w:r>
+        <w:rPr>
+          <w:rtl w:val="0"/>
+        </w:rPr>
+      </w:r>
+    </w:p>
+    <w:p>
+      <w:pPr>
+        <w:keepNext w:val="0"/>
+        <w:keepLines w:val="0"/>
+        <w:spacing w:before="480" w:line="240" w:lineRule="auto"/>
+        <w:rPr>
+          <w:b w:val="1"/>
+          <w:bCs w:val="1"/>
+          <w:sz w:val="24"/>
+          <w:szCs w:val="24"/>
+        </w:rPr>
+      </w:pPr>
+      <w:r>
+        <w:rPr>
+          <w:rtl w:val="0"/>
+        </w:rPr>
       </w:r>
     </w:p>
     <w:p>
@@ -2195,6 +2218,39 @@
           <w:rtl w:val="0"/>
         </w:rPr>
         <w:t xml:space="preserve">Documentación.</w:t>
+      </w:r>
+    </w:p>
+    <w:p>
+      <w:pPr>
+        <w:spacing w:after="240" w:before="0" w:line="240" w:lineRule="auto"/>
+        <w:rPr/>
+      </w:pPr>
+      <w:r>
+        <w:rPr>
+          <w:rtl w:val="0"/>
+        </w:rPr>
+      </w:r>
+    </w:p>
+    <w:p>
+      <w:pPr>
+        <w:spacing w:after="240" w:before="0" w:line="240" w:lineRule="auto"/>
+        <w:rPr/>
+      </w:pPr>
+      <w:r>
+        <w:rPr>
+          <w:rtl w:val="0"/>
+        </w:rPr>
+      </w:r>
+    </w:p>
+    <w:p>
+      <w:pPr>
+        <w:spacing w:after="240" w:before="0" w:line="240" w:lineRule="auto"/>
+        <w:rPr/>
+      </w:pPr>
+      <w:r>
+        <w:rPr>
+          <w:rtl w:val="0"/>
+        </w:rPr>
       </w:r>
     </w:p>
     <w:p>
@@ -2510,34 +2566,36 @@
               <w:rPr>
                 <w:rtl w:val="0"/>
               </w:rPr>
-            </w:r>
-          </w:p>
-        </w:tc>
-        <w:tc>
-          <w:tcPr>
-            <w:tcBorders>
-              <w:top w:color="000000" w:space="0" w:sz="8" w:val="single"/>
-              <w:left w:color="000000" w:space="0" w:sz="8" w:val="single"/>
-              <w:bottom w:color="000000" w:space="0" w:sz="8" w:val="single"/>
-              <w:right w:color="000000" w:space="0" w:sz="8" w:val="single"/>
-            </w:tcBorders>
-            <w:tcMar>
-              <w:top w:w="100.0" w:type="dxa"/>
-              <w:left w:w="100.0" w:type="dxa"/>
-              <w:bottom w:w="100.0" w:type="dxa"/>
-              <w:right w:w="100.0" w:type="dxa"/>
-            </w:tcMar>
-            <w:vAlign w:val="top"/>
-          </w:tcPr>
-          <w:p>
-            <w:pPr>
-              <w:spacing w:line="240" w:lineRule="auto"/>
-              <w:rPr/>
-            </w:pPr>
-            <w:r>
-              <w:rPr>
-                <w:rtl w:val="0"/>
-              </w:rPr>
+              <w:t xml:space="preserve">Terminado</w:t>
+            </w:r>
+          </w:p>
+        </w:tc>
+        <w:tc>
+          <w:tcPr>
+            <w:tcBorders>
+              <w:top w:color="000000" w:space="0" w:sz="8" w:val="single"/>
+              <w:left w:color="000000" w:space="0" w:sz="8" w:val="single"/>
+              <w:bottom w:color="000000" w:space="0" w:sz="8" w:val="single"/>
+              <w:right w:color="000000" w:space="0" w:sz="8" w:val="single"/>
+            </w:tcBorders>
+            <w:tcMar>
+              <w:top w:w="100.0" w:type="dxa"/>
+              <w:left w:w="100.0" w:type="dxa"/>
+              <w:bottom w:w="100.0" w:type="dxa"/>
+              <w:right w:w="100.0" w:type="dxa"/>
+            </w:tcMar>
+            <w:vAlign w:val="top"/>
+          </w:tcPr>
+          <w:p>
+            <w:pPr>
+              <w:spacing w:line="240" w:lineRule="auto"/>
+              <w:rPr/>
+            </w:pPr>
+            <w:r>
+              <w:rPr>
+                <w:rtl w:val="0"/>
+              </w:rPr>
+              <w:t xml:space="preserve">Se está trabajando en las pruebas manuales para la identificación de bugs o errores que puedan presentarse</w:t>
             </w:r>
           </w:p>
         </w:tc>
@@ -2631,34 +2689,36 @@
               <w:rPr>
                 <w:rtl w:val="0"/>
               </w:rPr>
-            </w:r>
-          </w:p>
-        </w:tc>
-        <w:tc>
-          <w:tcPr>
-            <w:tcBorders>
-              <w:top w:color="000000" w:space="0" w:sz="8" w:val="single"/>
-              <w:left w:color="000000" w:space="0" w:sz="8" w:val="single"/>
-              <w:bottom w:color="000000" w:space="0" w:sz="8" w:val="single"/>
-              <w:right w:color="000000" w:space="0" w:sz="8" w:val="single"/>
-            </w:tcBorders>
-            <w:tcMar>
-              <w:top w:w="100.0" w:type="dxa"/>
-              <w:left w:w="100.0" w:type="dxa"/>
-              <w:bottom w:w="100.0" w:type="dxa"/>
-              <w:right w:w="100.0" w:type="dxa"/>
-            </w:tcMar>
-            <w:vAlign w:val="top"/>
-          </w:tcPr>
-          <w:p>
-            <w:pPr>
-              <w:spacing w:line="240" w:lineRule="auto"/>
-              <w:rPr/>
-            </w:pPr>
-            <w:r>
-              <w:rPr>
-                <w:rtl w:val="0"/>
-              </w:rPr>
+              <w:t xml:space="preserve">En proceso</w:t>
+            </w:r>
+          </w:p>
+        </w:tc>
+        <w:tc>
+          <w:tcPr>
+            <w:tcBorders>
+              <w:top w:color="000000" w:space="0" w:sz="8" w:val="single"/>
+              <w:left w:color="000000" w:space="0" w:sz="8" w:val="single"/>
+              <w:bottom w:color="000000" w:space="0" w:sz="8" w:val="single"/>
+              <w:right w:color="000000" w:space="0" w:sz="8" w:val="single"/>
+            </w:tcBorders>
+            <w:tcMar>
+              <w:top w:w="100.0" w:type="dxa"/>
+              <w:left w:w="100.0" w:type="dxa"/>
+              <w:bottom w:w="100.0" w:type="dxa"/>
+              <w:right w:w="100.0" w:type="dxa"/>
+            </w:tcMar>
+            <w:vAlign w:val="top"/>
+          </w:tcPr>
+          <w:p>
+            <w:pPr>
+              <w:spacing w:line="240" w:lineRule="auto"/>
+              <w:rPr/>
+            </w:pPr>
+            <w:r>
+              <w:rPr>
+                <w:rtl w:val="0"/>
+              </w:rPr>
+              <w:t xml:space="preserve">Se trabaja en el arreglo de los errores identificados.</w:t>
             </w:r>
           </w:p>
         </w:tc>
@@ -2752,6 +2812,7 @@
               <w:rPr>
                 <w:rtl w:val="0"/>
               </w:rPr>
+              <w:t xml:space="preserve">Terminado</w:t>
             </w:r>
           </w:p>
         </w:tc>
@@ -2873,6 +2934,7 @@
               <w:rPr>
                 <w:rtl w:val="0"/>
               </w:rPr>
+              <w:t xml:space="preserve">Terminado</w:t>
             </w:r>
           </w:p>
         </w:tc>
@@ -2994,6 +3056,7 @@
               <w:rPr>
                 <w:rtl w:val="0"/>
               </w:rPr>
+              <w:t xml:space="preserve">terminado</w:t>
             </w:r>
           </w:p>
         </w:tc>
@@ -3115,6 +3178,7 @@
               <w:rPr>
                 <w:rtl w:val="0"/>
               </w:rPr>
+              <w:t xml:space="preserve">Terminado</w:t>
             </w:r>
           </w:p>
         </w:tc>
@@ -3236,6 +3300,7 @@
               <w:rPr>
                 <w:rtl w:val="0"/>
               </w:rPr>
+              <w:t xml:space="preserve">Terminado</w:t>
             </w:r>
           </w:p>
         </w:tc>
@@ -3357,6 +3422,7 @@
               <w:rPr>
                 <w:rtl w:val="0"/>
               </w:rPr>
+              <w:t xml:space="preserve">Terminado</w:t>
             </w:r>
           </w:p>
         </w:tc>
@@ -3409,6 +3475,42 @@
           <w:rtl w:val="0"/>
         </w:rPr>
         <w:t xml:space="preserve"> No es necesario evaluar las 31 subcaracterísticas de la norma. Para este taller se analizarán únicamente las más representativas.</w:t>
+      </w:r>
+    </w:p>
+    <w:p>
+      <w:pPr>
+        <w:keepNext w:val="0"/>
+        <w:keepLines w:val="0"/>
+        <w:spacing w:before="480" w:line="240" w:lineRule="auto"/>
+        <w:rPr>
+          <w:b w:val="1"/>
+          <w:bCs w:val="1"/>
+          <w:sz w:val="24"/>
+          <w:szCs w:val="24"/>
+        </w:rPr>
+      </w:pPr>
+      <w:r>
+        <w:rPr>
+          <w:rtl w:val="0"/>
+        </w:rPr>
+      </w:r>
+    </w:p>
+    <w:p>
+      <w:pPr>
+        <w:keepNext w:val="0"/>
+        <w:keepLines w:val="0"/>
+        <w:spacing w:before="480" w:line="240" w:lineRule="auto"/>
+        <w:rPr>
+          <w:b w:val="1"/>
+          <w:bCs w:val="1"/>
+          <w:sz w:val="24"/>
+          <w:szCs w:val="24"/>
+        </w:rPr>
+      </w:pPr>
+      <w:r>
+        <w:rPr>
+          <w:rtl w:val="0"/>
+        </w:rPr>
       </w:r>
     </w:p>
     <w:p>
@@ -4576,6 +4678,7 @@
               <w:rPr>
                 <w:rtl w:val="0"/>
               </w:rPr>
+              <w:t xml:space="preserve">9/10</w:t>
             </w:r>
           </w:p>
         </w:tc>
@@ -4640,6 +4743,7 @@
               <w:rPr>
                 <w:rtl w:val="0"/>
               </w:rPr>
+              <w:t xml:space="preserve">10/10</w:t>
             </w:r>
           </w:p>
         </w:tc>
@@ -4704,6 +4808,7 @@
               <w:rPr>
                 <w:rtl w:val="0"/>
               </w:rPr>
+              <w:t xml:space="preserve">10/10</w:t>
             </w:r>
           </w:p>
         </w:tc>
@@ -4768,6 +4873,7 @@
               <w:rPr>
                 <w:rtl w:val="0"/>
               </w:rPr>
+              <w:t xml:space="preserve">10/10</w:t>
             </w:r>
           </w:p>
         </w:tc>
@@ -4832,6 +4938,7 @@
               <w:rPr>
                 <w:rtl w:val="0"/>
               </w:rPr>
+              <w:t xml:space="preserve">10/10</w:t>
             </w:r>
           </w:p>
         </w:tc>
@@ -4896,6 +5003,7 @@
               <w:rPr>
                 <w:rtl w:val="0"/>
               </w:rPr>
+              <w:t xml:space="preserve">8/10</w:t>
             </w:r>
           </w:p>
         </w:tc>
@@ -4927,7 +5035,7 @@
         <w:rPr>
           <w:rtl w:val="0"/>
         </w:rPr>
-        <w:t xml:space="preserve">¿En qué aspectos coincidieron?</w:t>
+        <w:t xml:space="preserve">¿En qué aspectos coinciden?</w:t>
       </w:r>
     </w:p>
     <w:p>
@@ -5483,6 +5591,42 @@
       </w:pPr>
       <w:r>
         <w:rPr>
+          <w:rtl w:val="0"/>
+        </w:rPr>
+      </w:r>
+    </w:p>
+    <w:p>
+      <w:pPr>
+        <w:keepNext w:val="0"/>
+        <w:keepLines w:val="0"/>
+        <w:spacing w:before="480" w:line="240" w:lineRule="auto"/>
+        <w:rPr>
+          <w:b w:val="1"/>
+          <w:bCs w:val="1"/>
+          <w:sz w:val="24"/>
+          <w:szCs w:val="24"/>
+        </w:rPr>
+      </w:pPr>
+      <w:r>
+        <w:rPr>
+          <w:rtl w:val="0"/>
+        </w:rPr>
+      </w:r>
+    </w:p>
+    <w:p>
+      <w:pPr>
+        <w:keepNext w:val="0"/>
+        <w:keepLines w:val="0"/>
+        <w:spacing w:before="480" w:line="240" w:lineRule="auto"/>
+        <w:rPr>
+          <w:b w:val="1"/>
+          <w:bCs w:val="1"/>
+          <w:sz w:val="24"/>
+          <w:szCs w:val="24"/>
+        </w:rPr>
+      </w:pPr>
+      <w:r>
+        <w:rPr>
           <w:b w:val="1"/>
           <w:bCs w:val="1"/>
           <w:sz w:val="24"/>
@@ -5649,6 +5793,31 @@
     </w:p>
     <w:p>
       <w:pPr>
+        <w:spacing w:after="0" w:before="240" w:line="240" w:lineRule="auto"/>
+        <w:ind w:left="720" w:firstLine="0"/>
+        <w:rPr/>
+      </w:pPr>
+      <w:r>
+        <w:rPr>
+          <w:rtl w:val="0"/>
+        </w:rPr>
+        <w:t xml:space="preserve">R. El aspecto más importante de la ISO 25010, es definitivamente la evaluación de calidad, ya que con sus estándares podemos evaluar de manera precisa la calidad de nuestro proyecto, para poderle entregar al cliente un producto con los estandares reuqeridos y que cumppla y satisfasca sus necesidades.</w:t>
+      </w:r>
+    </w:p>
+    <w:p>
+      <w:pPr>
+        <w:spacing w:after="0" w:before="240" w:line="240" w:lineRule="auto"/>
+        <w:ind w:left="720" w:firstLine="0"/>
+        <w:rPr/>
+      </w:pPr>
+      <w:r>
+        <w:rPr>
+          <w:rtl w:val="0"/>
+        </w:rPr>
+      </w:r>
+    </w:p>
+    <w:p>
+      <w:pPr>
         <w:numPr>
           <w:ilvl w:val="0"/>
           <w:numId w:val="7"/>
@@ -5666,6 +5835,44 @@
     </w:p>
     <w:p>
       <w:pPr>
+        <w:spacing w:after="0" w:before="0" w:line="240" w:lineRule="auto"/>
+        <w:ind w:left="720" w:firstLine="0"/>
+        <w:rPr/>
+      </w:pPr>
+      <w:r>
+        <w:rPr>
+          <w:rtl w:val="0"/>
+        </w:rPr>
+      </w:r>
+    </w:p>
+    <w:p>
+      <w:pPr>
+        <w:spacing w:after="0" w:before="0" w:line="240" w:lineRule="auto"/>
+        <w:ind w:left="720" w:firstLine="0"/>
+        <w:rPr/>
+      </w:pPr>
+      <w:r>
+        <w:rPr>
+          <w:rtl w:val="0"/>
+        </w:rPr>
+        <w:t xml:space="preserve">R. La característica que le cambiaríamos a nuestro proyecto sería que a la hora de que un cliente realice un producto personalizado, la imagen muestra el cambio que va haciendo.</w:t>
+      </w:r>
+    </w:p>
+    <w:p>
+      <w:pPr>
+        <w:spacing w:after="0" w:before="0" w:line="240" w:lineRule="auto"/>
+        <w:ind w:left="720" w:firstLine="0"/>
+        <w:rPr/>
+      </w:pPr>
+      <w:r>
+        <w:rPr>
+          <w:rtl w:val="0"/>
+        </w:rPr>
+        <w:t xml:space="preserve">  </w:t>
+      </w:r>
+    </w:p>
+    <w:p>
+      <w:pPr>
         <w:numPr>
           <w:ilvl w:val="0"/>
           <w:numId w:val="7"/>
@@ -5683,8 +5890,57 @@
     </w:p>
     <w:p>
       <w:pPr>
+        <w:spacing w:after="240" w:before="0" w:line="240" w:lineRule="auto"/>
+        <w:ind w:left="720" w:firstLine="0"/>
+        <w:rPr/>
+      </w:pPr>
+      <w:r>
+        <w:rPr>
+          <w:rtl w:val="0"/>
+        </w:rPr>
+        <w:t xml:space="preserve">R. Influye positivamente ya que nos ayuda a tener en cuenta los errores que se presentan y poderlos corregir a tiempo antes de entregarle el producto al cliente</w:t>
+      </w:r>
+    </w:p>
+    <w:p>
+      <w:pPr>
         <w:spacing w:line="240" w:lineRule="auto"/>
         <w:rPr/>
+      </w:pPr>
+      <w:r>
+        <w:rPr>
+          <w:rtl w:val="0"/>
+        </w:rPr>
+      </w:r>
+    </w:p>
+    <w:p>
+      <w:pPr>
+        <w:keepNext w:val="0"/>
+        <w:keepLines w:val="0"/>
+        <w:spacing w:before="480" w:line="240" w:lineRule="auto"/>
+        <w:rPr>
+          <w:b w:val="1"/>
+          <w:bCs w:val="1"/>
+          <w:sz w:val="24"/>
+          <w:szCs w:val="24"/>
+        </w:rPr>
+      </w:pPr>
+      <w:r>
+        <w:rPr>
+          <w:rtl w:val="0"/>
+        </w:rPr>
+      </w:r>
+    </w:p>
+    <w:p>
+      <w:pPr>
+        <w:keepNext w:val="0"/>
+        <w:keepLines w:val="0"/>
+        <w:spacing w:before="480" w:line="240" w:lineRule="auto"/>
+        <w:rPr>
+          <w:b w:val="1"/>
+          <w:bCs w:val="1"/>
+          <w:sz w:val="24"/>
+          <w:szCs w:val="24"/>
+        </w:rPr>
       </w:pPr>
       <w:r>
         <w:rPr>
@@ -7239,116 +7495,6 @@
       </w:rPr>
     </w:lvl>
   </w:abstractNum>
-  <w:abstractNum w:abstractNumId="8">
-    <w:lvl w:ilvl="0">
-      <w:start w:val="1"/>
-      <w:numFmt w:val="decimal"/>
-      <w:lvlText w:val="%1."/>
-      <w:lvlJc w:val="left"/>
-      <w:pPr>
-        <w:ind w:left="720" w:hanging="360"/>
-      </w:pPr>
-      <w:rPr>
-        <w:u w:val="none"/>
-      </w:rPr>
-    </w:lvl>
-    <w:lvl w:ilvl="1">
-      <w:start w:val="1"/>
-      <w:numFmt w:val="lowerLetter"/>
-      <w:lvlText w:val="%2."/>
-      <w:lvlJc w:val="left"/>
-      <w:pPr>
-        <w:ind w:left="1440" w:hanging="360"/>
-      </w:pPr>
-      <w:rPr>
-        <w:u w:val="none"/>
-      </w:rPr>
-    </w:lvl>
-    <w:lvl w:ilvl="2">
-      <w:start w:val="1"/>
-      <w:numFmt w:val="lowerRoman"/>
-      <w:lvlText w:val="%3."/>
-      <w:lvlJc w:val="right"/>
-      <w:pPr>
-        <w:ind w:left="2160" w:hanging="360"/>
-      </w:pPr>
-      <w:rPr>
-        <w:u w:val="none"/>
-      </w:rPr>
-    </w:lvl>
-    <w:lvl w:ilvl="3">
-      <w:start w:val="1"/>
-      <w:numFmt w:val="decimal"/>
-      <w:lvlText w:val="%4."/>
-      <w:lvlJc w:val="left"/>
-      <w:pPr>
-        <w:ind w:left="2880" w:hanging="360"/>
-      </w:pPr>
-      <w:rPr>
-        <w:u w:val="none"/>
-      </w:rPr>
-    </w:lvl>
-    <w:lvl w:ilvl="4">
-      <w:start w:val="1"/>
-      <w:numFmt w:val="lowerLetter"/>
-      <w:lvlText w:val="%5."/>
-      <w:lvlJc w:val="left"/>
-      <w:pPr>
-        <w:ind w:left="3600" w:hanging="360"/>
-      </w:pPr>
-      <w:rPr>
-        <w:u w:val="none"/>
-      </w:rPr>
-    </w:lvl>
-    <w:lvl w:ilvl="5">
-      <w:start w:val="1"/>
-      <w:numFmt w:val="lowerRoman"/>
-      <w:lvlText w:val="%6."/>
-      <w:lvlJc w:val="right"/>
-      <w:pPr>
-        <w:ind w:left="4320" w:hanging="360"/>
-      </w:pPr>
-      <w:rPr>
-        <w:u w:val="none"/>
-      </w:rPr>
-    </w:lvl>
-    <w:lvl w:ilvl="6">
-      <w:start w:val="1"/>
-      <w:numFmt w:val="decimal"/>
-      <w:lvlText w:val="%7."/>
-      <w:lvlJc w:val="left"/>
-      <w:pPr>
-        <w:ind w:left="5040" w:hanging="360"/>
-      </w:pPr>
-      <w:rPr>
-        <w:u w:val="none"/>
-      </w:rPr>
-    </w:lvl>
-    <w:lvl w:ilvl="7">
-      <w:start w:val="1"/>
-      <w:numFmt w:val="lowerLetter"/>
-      <w:lvlText w:val="%8."/>
-      <w:lvlJc w:val="left"/>
-      <w:pPr>
-        <w:ind w:left="5760" w:hanging="360"/>
-      </w:pPr>
-      <w:rPr>
-        <w:u w:val="none"/>
-      </w:rPr>
-    </w:lvl>
-    <w:lvl w:ilvl="8">
-      <w:start w:val="1"/>
-      <w:numFmt w:val="lowerRoman"/>
-      <w:lvlText w:val="%9."/>
-      <w:lvlJc w:val="right"/>
-      <w:pPr>
-        <w:ind w:left="6480" w:hanging="360"/>
-      </w:pPr>
-      <w:rPr>
-        <w:u w:val="none"/>
-      </w:rPr>
-    </w:lvl>
-  </w:abstractNum>
   <w:num w:numId="1">
     <w:abstractNumId w:val="1"/>
   </w:num>
@@ -7369,9 +7515,6 @@
   </w:num>
   <w:num w:numId="7">
     <w:abstractNumId w:val="7"/>
-  </w:num>
-  <w:num w:numId="8">
-    <w:abstractNumId w:val="8"/>
   </w:num>
 </w:numbering>
 </file>

</xml_diff>